<commit_message>
creacion de base de datos
</commit_message>
<xml_diff>
--- a/DOCUMENTACION/ENTREGABLE 4/ENTREGABLE 4.docx
+++ b/DOCUMENTACION/ENTREGABLE 4/ENTREGABLE 4.docx
@@ -13643,7 +13643,7 @@
           <v:shape id="_x0000_i1025" type="#_x0000_t75" style="width:689pt;height:449.3pt" o:ole="">
             <v:imagedata r:id="rId16" o:title=""/>
           </v:shape>
-          <o:OLEObject Type="Embed" ProgID="Visio.Drawing.15" ShapeID="_x0000_i1025" DrawAspect="Content" ObjectID="_1844179764" r:id="rId17"/>
+          <o:OLEObject Type="Embed" ProgID="Visio.Drawing.15" ShapeID="_x0000_i1025" DrawAspect="Content" ObjectID="_1844229432" r:id="rId17"/>
         </w:object>
       </w:r>
     </w:p>
@@ -14082,7 +14082,7 @@
           <v:shape id="_x0000_i1026" type="#_x0000_t75" style="width:706.35pt;height:426.55pt" o:ole="">
             <v:imagedata r:id="rId18" o:title=""/>
           </v:shape>
-          <o:OLEObject Type="Embed" ProgID="Visio.Drawing.15" ShapeID="_x0000_i1026" DrawAspect="Content" ObjectID="_1844179765" r:id="rId19"/>
+          <o:OLEObject Type="Embed" ProgID="Visio.Drawing.15" ShapeID="_x0000_i1026" DrawAspect="Content" ObjectID="_1844229433" r:id="rId19"/>
         </w:object>
       </w:r>
     </w:p>
@@ -14179,7 +14179,7 @@
           <v:shape id="_x0000_i1027" type="#_x0000_t75" style="width:718.2pt;height:403.3pt" o:ole="">
             <v:imagedata r:id="rId20" o:title=""/>
           </v:shape>
-          <o:OLEObject Type="Embed" ProgID="Visio.Drawing.15" ShapeID="_x0000_i1027" DrawAspect="Content" ObjectID="_1844179766" r:id="rId21"/>
+          <o:OLEObject Type="Embed" ProgID="Visio.Drawing.15" ShapeID="_x0000_i1027" DrawAspect="Content" ObjectID="_1844229434" r:id="rId21"/>
         </w:object>
       </w:r>
     </w:p>
@@ -14263,7 +14263,7 @@
           <v:shape id="_x0000_i1028" type="#_x0000_t75" style="width:719.55pt;height:384.15pt" o:ole="">
             <v:imagedata r:id="rId22" o:title=""/>
           </v:shape>
-          <o:OLEObject Type="Embed" ProgID="Visio.Drawing.15" ShapeID="_x0000_i1028" DrawAspect="Content" ObjectID="_1844179767" r:id="rId23"/>
+          <o:OLEObject Type="Embed" ProgID="Visio.Drawing.15" ShapeID="_x0000_i1028" DrawAspect="Content" ObjectID="_1844229435" r:id="rId23"/>
         </w:object>
       </w:r>
     </w:p>
@@ -14777,7 +14777,7 @@
                 <v:shape id="_x0000_i1029" type="#_x0000_t75" style="width:74.75pt;height:31.45pt" o:ole="">
                   <v:imagedata r:id="rId24" o:title=""/>
                 </v:shape>
-                <o:OLEObject Type="Embed" ProgID="Visio.Drawing.15" ShapeID="_x0000_i1029" DrawAspect="Content" ObjectID="_1844179768" r:id="rId25"/>
+                <o:OLEObject Type="Embed" ProgID="Visio.Drawing.15" ShapeID="_x0000_i1029" DrawAspect="Content" ObjectID="_1844229436" r:id="rId25"/>
               </w:object>
             </w:r>
           </w:p>
@@ -14843,7 +14843,7 @@
                 <v:shape id="_x0000_i1030" type="#_x0000_t75" style="width:94.35pt;height:46.05pt" o:ole="">
                   <v:imagedata r:id="rId26" o:title=""/>
                 </v:shape>
-                <o:OLEObject Type="Embed" ProgID="Visio.Drawing.15" ShapeID="_x0000_i1030" DrawAspect="Content" ObjectID="_1844179769" r:id="rId27"/>
+                <o:OLEObject Type="Embed" ProgID="Visio.Drawing.15" ShapeID="_x0000_i1030" DrawAspect="Content" ObjectID="_1844229437" r:id="rId27"/>
               </w:object>
             </w:r>
           </w:p>
@@ -14937,7 +14937,7 @@
                 <v:shape id="_x0000_i1031" type="#_x0000_t75" style="width:73.8pt;height:46.05pt" o:ole="">
                   <v:imagedata r:id="rId28" o:title=""/>
                 </v:shape>
-                <o:OLEObject Type="Embed" ProgID="Visio.Drawing.15" ShapeID="_x0000_i1031" DrawAspect="Content" ObjectID="_1844179770" r:id="rId29"/>
+                <o:OLEObject Type="Embed" ProgID="Visio.Drawing.15" ShapeID="_x0000_i1031" DrawAspect="Content" ObjectID="_1844229438" r:id="rId29"/>
               </w:object>
             </w:r>
           </w:p>
@@ -15003,7 +15003,7 @@
                 <v:shape id="_x0000_i1032" type="#_x0000_t75" style="width:74.75pt;height:46.05pt" o:ole="">
                   <v:imagedata r:id="rId30" o:title=""/>
                 </v:shape>
-                <o:OLEObject Type="Embed" ProgID="Visio.Drawing.15" ShapeID="_x0000_i1032" DrawAspect="Content" ObjectID="_1844179771" r:id="rId31"/>
+                <o:OLEObject Type="Embed" ProgID="Visio.Drawing.15" ShapeID="_x0000_i1032" DrawAspect="Content" ObjectID="_1844229439" r:id="rId31"/>
               </w:object>
             </w:r>
           </w:p>
@@ -15069,7 +15069,7 @@
                 <v:shape id="_x0000_i1033" type="#_x0000_t75" style="width:74.75pt;height:46.05pt" o:ole="">
                   <v:imagedata r:id="rId32" o:title=""/>
                 </v:shape>
-                <o:OLEObject Type="Embed" ProgID="Visio.Drawing.15" ShapeID="_x0000_i1033" DrawAspect="Content" ObjectID="_1844179772" r:id="rId33"/>
+                <o:OLEObject Type="Embed" ProgID="Visio.Drawing.15" ShapeID="_x0000_i1033" DrawAspect="Content" ObjectID="_1844229440" r:id="rId33"/>
               </w:object>
             </w:r>
           </w:p>
@@ -15135,7 +15135,7 @@
                 <v:shape id="_x0000_i1034" type="#_x0000_t75" style="width:78.85pt;height:46.05pt" o:ole="">
                   <v:imagedata r:id="rId34" o:title=""/>
                 </v:shape>
-                <o:OLEObject Type="Embed" ProgID="Visio.Drawing.15" ShapeID="_x0000_i1034" DrawAspect="Content" ObjectID="_1844179773" r:id="rId35"/>
+                <o:OLEObject Type="Embed" ProgID="Visio.Drawing.15" ShapeID="_x0000_i1034" DrawAspect="Content" ObjectID="_1844229441" r:id="rId35"/>
               </w:object>
             </w:r>
           </w:p>
@@ -15201,7 +15201,7 @@
                 <v:shape id="_x0000_i1035" type="#_x0000_t75" style="width:74.75pt;height:46.05pt" o:ole="">
                   <v:imagedata r:id="rId36" o:title=""/>
                 </v:shape>
-                <o:OLEObject Type="Embed" ProgID="Visio.Drawing.15" ShapeID="_x0000_i1035" DrawAspect="Content" ObjectID="_1844179774" r:id="rId37"/>
+                <o:OLEObject Type="Embed" ProgID="Visio.Drawing.15" ShapeID="_x0000_i1035" DrawAspect="Content" ObjectID="_1844229442" r:id="rId37"/>
               </w:object>
             </w:r>
           </w:p>
@@ -15263,7 +15263,7 @@
                 <v:shape id="_x0000_i1036" type="#_x0000_t75" style="width:73.8pt;height:46.05pt" o:ole="">
                   <v:imagedata r:id="rId38" o:title=""/>
                 </v:shape>
-                <o:OLEObject Type="Embed" ProgID="Visio.Drawing.15" ShapeID="_x0000_i1036" DrawAspect="Content" ObjectID="_1844179775" r:id="rId39"/>
+                <o:OLEObject Type="Embed" ProgID="Visio.Drawing.15" ShapeID="_x0000_i1036" DrawAspect="Content" ObjectID="_1844229443" r:id="rId39"/>
               </w:object>
             </w:r>
           </w:p>
@@ -15515,7 +15515,7 @@
           <v:shape id="_x0000_i1037" type="#_x0000_t75" style="width:463pt;height:473.9pt" o:ole="">
             <v:imagedata r:id="rId40" o:title=""/>
           </v:shape>
-          <o:OLEObject Type="Embed" ProgID="Visio.Drawing.15" ShapeID="_x0000_i1037" DrawAspect="Content" ObjectID="_1844179776" r:id="rId41"/>
+          <o:OLEObject Type="Embed" ProgID="Visio.Drawing.15" ShapeID="_x0000_i1037" DrawAspect="Content" ObjectID="_1844229444" r:id="rId41"/>
         </w:object>
       </w:r>
     </w:p>
@@ -15630,7 +15630,7 @@
           <v:shape id="_x0000_i1038" type="#_x0000_t75" style="width:661.65pt;height:362.3pt" o:ole="">
             <v:imagedata r:id="rId42" o:title=""/>
           </v:shape>
-          <o:OLEObject Type="Embed" ProgID="Visio.Drawing.15" ShapeID="_x0000_i1038" DrawAspect="Content" ObjectID="_1844179777" r:id="rId43"/>
+          <o:OLEObject Type="Embed" ProgID="Visio.Drawing.15" ShapeID="_x0000_i1038" DrawAspect="Content" ObjectID="_1844229445" r:id="rId43"/>
         </w:object>
       </w:r>
     </w:p>
@@ -15739,7 +15739,7 @@
           <v:shape id="_x0000_i1039" type="#_x0000_t75" style="width:456.15pt;height:496.25pt" o:ole="">
             <v:imagedata r:id="rId44" o:title=""/>
           </v:shape>
-          <o:OLEObject Type="Embed" ProgID="Visio.Drawing.15" ShapeID="_x0000_i1039" DrawAspect="Content" ObjectID="_1844179778" r:id="rId45"/>
+          <o:OLEObject Type="Embed" ProgID="Visio.Drawing.15" ShapeID="_x0000_i1039" DrawAspect="Content" ObjectID="_1844229446" r:id="rId45"/>
         </w:object>
       </w:r>
     </w:p>
@@ -15872,7 +15872,7 @@
           <v:shape id="_x0000_i1040" type="#_x0000_t75" style="width:602.45pt;height:371.4pt" o:ole="">
             <v:imagedata r:id="rId46" o:title=""/>
           </v:shape>
-          <o:OLEObject Type="Embed" ProgID="Visio.Drawing.15" ShapeID="_x0000_i1040" DrawAspect="Content" ObjectID="_1844179779" r:id="rId47"/>
+          <o:OLEObject Type="Embed" ProgID="Visio.Drawing.15" ShapeID="_x0000_i1040" DrawAspect="Content" ObjectID="_1844229447" r:id="rId47"/>
         </w:object>
       </w:r>
     </w:p>
@@ -16002,7 +16002,7 @@
           <v:shape id="_x0000_i1041" type="#_x0000_t75" style="width:486.7pt;height:514.05pt" o:ole="">
             <v:imagedata r:id="rId48" o:title=""/>
           </v:shape>
-          <o:OLEObject Type="Embed" ProgID="Visio.Drawing.15" ShapeID="_x0000_i1041" DrawAspect="Content" ObjectID="_1844179780" r:id="rId49"/>
+          <o:OLEObject Type="Embed" ProgID="Visio.Drawing.15" ShapeID="_x0000_i1041" DrawAspect="Content" ObjectID="_1844229448" r:id="rId49"/>
         </w:object>
       </w:r>
     </w:p>
@@ -16117,7 +16117,7 @@
           <v:shape id="_x0000_i1042" type="#_x0000_t75" style="width:465.25pt;height:498.55pt" o:ole="">
             <v:imagedata r:id="rId50" o:title=""/>
           </v:shape>
-          <o:OLEObject Type="Embed" ProgID="Visio.Drawing.15" ShapeID="_x0000_i1042" DrawAspect="Content" ObjectID="_1844179781" r:id="rId51"/>
+          <o:OLEObject Type="Embed" ProgID="Visio.Drawing.15" ShapeID="_x0000_i1042" DrawAspect="Content" ObjectID="_1844229449" r:id="rId51"/>
         </w:object>
       </w:r>
     </w:p>
@@ -16245,7 +16245,7 @@
           <v:shape id="_x0000_i1043" type="#_x0000_t75" style="width:502.2pt;height:7in" o:ole="">
             <v:imagedata r:id="rId52" o:title=""/>
           </v:shape>
-          <o:OLEObject Type="Embed" ProgID="Visio.Drawing.15" ShapeID="_x0000_i1043" DrawAspect="Content" ObjectID="_1844179782" r:id="rId53"/>
+          <o:OLEObject Type="Embed" ProgID="Visio.Drawing.15" ShapeID="_x0000_i1043" DrawAspect="Content" ObjectID="_1844229450" r:id="rId53"/>
         </w:object>
       </w:r>
     </w:p>
@@ -16360,7 +16360,7 @@
           <v:shape id="_x0000_i1044" type="#_x0000_t75" style="width:490.35pt;height:492.6pt" o:ole="">
             <v:imagedata r:id="rId54" o:title=""/>
           </v:shape>
-          <o:OLEObject Type="Embed" ProgID="Visio.Drawing.15" ShapeID="_x0000_i1044" DrawAspect="Content" ObjectID="_1844179783" r:id="rId55"/>
+          <o:OLEObject Type="Embed" ProgID="Visio.Drawing.15" ShapeID="_x0000_i1044" DrawAspect="Content" ObjectID="_1844229451" r:id="rId55"/>
         </w:object>
       </w:r>
     </w:p>
@@ -16525,7 +16525,7 @@
           <v:shape id="_x0000_i1045" type="#_x0000_t75" style="width:413.75pt;height:468.9pt" o:ole="">
             <v:imagedata r:id="rId56" o:title=""/>
           </v:shape>
-          <o:OLEObject Type="Embed" ProgID="Visio.Drawing.15" ShapeID="_x0000_i1045" DrawAspect="Content" ObjectID="_1844179784" r:id="rId57"/>
+          <o:OLEObject Type="Embed" ProgID="Visio.Drawing.15" ShapeID="_x0000_i1045" DrawAspect="Content" ObjectID="_1844229452" r:id="rId57"/>
         </w:object>
       </w:r>
     </w:p>
@@ -16687,7 +16687,7 @@
           <v:shape id="_x0000_i1046" type="#_x0000_t75" style="width:396.45pt;height:481.2pt" o:ole="">
             <v:imagedata r:id="rId58" o:title=""/>
           </v:shape>
-          <o:OLEObject Type="Embed" ProgID="Visio.Drawing.15" ShapeID="_x0000_i1046" DrawAspect="Content" ObjectID="_1844179785" r:id="rId59"/>
+          <o:OLEObject Type="Embed" ProgID="Visio.Drawing.15" ShapeID="_x0000_i1046" DrawAspect="Content" ObjectID="_1844229453" r:id="rId59"/>
         </w:object>
       </w:r>
     </w:p>
@@ -28972,10 +28972,10 @@
           <w:szCs w:val="24"/>
         </w:rPr>
         <w:object w:dxaOrig="1500" w:dyaOrig="980" w14:anchorId="4D5CCC98">
-          <v:shape id="_x0000_i1091" type="#_x0000_t75" style="width:75.2pt;height:49.2pt" o:ole="">
+          <v:shape id="_x0000_i1049" type="#_x0000_t75" style="width:75.2pt;height:49.2pt" o:ole="">
             <v:imagedata r:id="rId78" o:title=""/>
           </v:shape>
-          <o:OLEObject Type="Embed" ProgID="Acrobat.Document.DC" ShapeID="_x0000_i1091" DrawAspect="Icon" ObjectID="_1844179786" r:id="rId79"/>
+          <o:OLEObject Type="Embed" ProgID="Acrobat.Document.DC" ShapeID="_x0000_i1049" DrawAspect="Icon" ObjectID="_1844229454" r:id="rId79"/>
         </w:object>
       </w:r>
     </w:p>
@@ -30008,15 +30008,7 @@
           <w:sz w:val="24"/>
           <w:szCs w:val="24"/>
         </w:rPr>
-        <w:t xml:space="preserve">: </w:t>
-      </w:r>
-      <w:r>
-        <w:rPr>
-          <w:rFonts w:cstheme="minorHAnsi"/>
-          <w:sz w:val="24"/>
-          <w:szCs w:val="24"/>
-        </w:rPr>
-        <w:t>Usuario con privilegios completos sobre el sistema SIGEPAN, responsable de administrar usuarios, configuraciones, procesos y reportes.</w:t>
+        <w:t>: Usuario con privilegios completos sobre el sistema SIGEPAN, responsable de administrar usuarios, configuraciones, procesos y reportes.</w:t>
       </w:r>
     </w:p>
     <w:p>
@@ -30060,15 +30052,7 @@
           <w:sz w:val="24"/>
           <w:szCs w:val="24"/>
         </w:rPr>
-        <w:t xml:space="preserve">: </w:t>
-      </w:r>
-      <w:r>
-        <w:rPr>
-          <w:rFonts w:cstheme="minorHAnsi"/>
-          <w:sz w:val="24"/>
-          <w:szCs w:val="24"/>
-        </w:rPr>
-        <w:t>Proceso mediante el cual el sistema verifica la identidad de un usuario utilizando credenciales previamente registradas.</w:t>
+        <w:t>: Proceso mediante el cual el sistema verifica la identidad de un usuario utilizando credenciales previamente registradas.</w:t>
       </w:r>
     </w:p>
     <w:p>
@@ -30112,15 +30096,7 @@
           <w:sz w:val="24"/>
           <w:szCs w:val="24"/>
         </w:rPr>
-        <w:t xml:space="preserve">: </w:t>
-      </w:r>
-      <w:r>
-        <w:rPr>
-          <w:rFonts w:cstheme="minorHAnsi"/>
-          <w:sz w:val="24"/>
-          <w:szCs w:val="24"/>
-        </w:rPr>
-        <w:t>Conjunto organizado de información almacenada electrónicamente que permite registrar, consultar y administrar los datos utilizados por SIGEPAN.</w:t>
+        <w:t>: Conjunto organizado de información almacenada electrónicamente que permite registrar, consultar y administrar los datos utilizados por SIGEPAN.</w:t>
       </w:r>
     </w:p>
     <w:p>
@@ -30164,15 +30140,7 @@
           <w:sz w:val="24"/>
           <w:szCs w:val="24"/>
         </w:rPr>
-        <w:t xml:space="preserve">: </w:t>
-      </w:r>
-      <w:r>
-        <w:rPr>
-          <w:rFonts w:cstheme="minorHAnsi"/>
-          <w:sz w:val="24"/>
-          <w:szCs w:val="24"/>
-        </w:rPr>
-        <w:t>Registro automático de los eventos y acciones ejecutadas por los usuarios dentro del sistema para fines de auditoría y trazabilidad.</w:t>
+        <w:t>: Registro automático de los eventos y acciones ejecutadas por los usuarios dentro del sistema para fines de auditoría y trazabilidad.</w:t>
       </w:r>
     </w:p>
     <w:p>
@@ -30216,15 +30184,7 @@
           <w:sz w:val="24"/>
           <w:szCs w:val="24"/>
         </w:rPr>
-        <w:t xml:space="preserve">: </w:t>
-      </w:r>
-      <w:r>
-        <w:rPr>
-          <w:rFonts w:cstheme="minorHAnsi"/>
-          <w:sz w:val="24"/>
-          <w:szCs w:val="24"/>
-        </w:rPr>
-        <w:t>Módulo encargado de registrar la apertura, operaciones y cierre de caja durante la jornada laboral.</w:t>
+        <w:t>: Módulo encargado de registrar la apertura, operaciones y cierre de caja durante la jornada laboral.</w:t>
       </w:r>
     </w:p>
     <w:p>
@@ -30269,15 +30229,7 @@
           <w:sz w:val="24"/>
           <w:szCs w:val="24"/>
         </w:rPr>
-        <w:t xml:space="preserve">: </w:t>
-      </w:r>
-      <w:r>
-        <w:rPr>
-          <w:rFonts w:cstheme="minorHAnsi"/>
-          <w:sz w:val="24"/>
-          <w:szCs w:val="24"/>
-        </w:rPr>
-        <w:t>Clasificación utilizada para organizar los productos comercializados por la panadería.</w:t>
+        <w:t>: Clasificación utilizada para organizar los productos comercializados por la panadería.</w:t>
       </w:r>
     </w:p>
     <w:p>
@@ -30321,15 +30273,7 @@
           <w:sz w:val="24"/>
           <w:szCs w:val="24"/>
         </w:rPr>
-        <w:t xml:space="preserve">: </w:t>
-      </w:r>
-      <w:r>
-        <w:rPr>
-          <w:rFonts w:cstheme="minorHAnsi"/>
-          <w:sz w:val="24"/>
-          <w:szCs w:val="24"/>
-        </w:rPr>
-        <w:t>Persona física o jurídica que adquiere productos comercializados mediante el sistema SIGEPAN.</w:t>
+        <w:t>: Persona física o jurídica que adquiere productos comercializados mediante el sistema SIGEPAN.</w:t>
       </w:r>
     </w:p>
     <w:p>
@@ -30373,15 +30317,7 @@
           <w:sz w:val="24"/>
           <w:szCs w:val="24"/>
         </w:rPr>
-        <w:t xml:space="preserve">: </w:t>
-      </w:r>
-      <w:r>
-        <w:rPr>
-          <w:rFonts w:cstheme="minorHAnsi"/>
-          <w:sz w:val="24"/>
-          <w:szCs w:val="24"/>
-        </w:rPr>
-        <w:t xml:space="preserve">Siglas de </w:t>
+        <w:t xml:space="preserve">: Siglas de </w:t>
       </w:r>
       <w:proofErr w:type="spellStart"/>
       <w:r>
@@ -30463,15 +30399,7 @@
           <w:sz w:val="24"/>
           <w:szCs w:val="24"/>
         </w:rPr>
-        <w:t xml:space="preserve">: </w:t>
-      </w:r>
-      <w:r>
-        <w:rPr>
-          <w:rFonts w:cstheme="minorHAnsi"/>
-          <w:sz w:val="24"/>
-          <w:szCs w:val="24"/>
-        </w:rPr>
-        <w:t>Panel gráfico que presenta indicadores relevantes para apoyar la toma de decisiones gerenciales.</w:t>
+        <w:t>: Panel gráfico que presenta indicadores relevantes para apoyar la toma de decisiones gerenciales.</w:t>
       </w:r>
     </w:p>
     <w:p>
@@ -30515,15 +30443,7 @@
           <w:sz w:val="24"/>
           <w:szCs w:val="24"/>
         </w:rPr>
-        <w:t xml:space="preserve">: </w:t>
-      </w:r>
-      <w:r>
-        <w:rPr>
-          <w:rFonts w:cstheme="minorHAnsi"/>
-          <w:sz w:val="24"/>
-          <w:szCs w:val="24"/>
-        </w:rPr>
-        <w:t>Framework de desarrollo web basado en Python utilizado para implementar el sistema SIGEPAN.</w:t>
+        <w:t>: Framework de desarrollo web basado en Python utilizado para implementar el sistema SIGEPAN.</w:t>
       </w:r>
     </w:p>
     <w:p>
@@ -30567,15 +30487,7 @@
           <w:sz w:val="24"/>
           <w:szCs w:val="24"/>
         </w:rPr>
-        <w:t xml:space="preserve">: </w:t>
-      </w:r>
-      <w:r>
-        <w:rPr>
-          <w:rFonts w:cstheme="minorHAnsi"/>
-          <w:sz w:val="24"/>
-          <w:szCs w:val="24"/>
-        </w:rPr>
-        <w:t>Objeto o elemento del mundo real representado dentro de la base de datos mediante una tabla.</w:t>
+        <w:t>: Objeto o elemento del mundo real representado dentro de la base de datos mediante una tabla.</w:t>
       </w:r>
     </w:p>
     <w:p>
@@ -30619,15 +30531,7 @@
           <w:sz w:val="24"/>
           <w:szCs w:val="24"/>
         </w:rPr>
-        <w:t xml:space="preserve">: </w:t>
-      </w:r>
-      <w:r>
-        <w:rPr>
-          <w:rFonts w:cstheme="minorHAnsi"/>
-          <w:sz w:val="24"/>
-          <w:szCs w:val="24"/>
-        </w:rPr>
-        <w:t>Conjunto de herramientas y bibliotecas que facilitan el desarrollo de aplicaciones.</w:t>
+        <w:t>: Conjunto de herramientas y bibliotecas que facilitan el desarrollo de aplicaciones.</w:t>
       </w:r>
     </w:p>
     <w:p>
@@ -30671,15 +30575,7 @@
           <w:sz w:val="24"/>
           <w:szCs w:val="24"/>
         </w:rPr>
-        <w:t xml:space="preserve">: </w:t>
-      </w:r>
-      <w:r>
-        <w:rPr>
-          <w:rFonts w:cstheme="minorHAnsi"/>
-          <w:sz w:val="24"/>
-          <w:szCs w:val="24"/>
-        </w:rPr>
-        <w:t>Conjunto de productos disponibles para la venta o utilización dentro de la empresa.</w:t>
+        <w:t>: Conjunto de productos disponibles para la venta o utilización dentro de la empresa.</w:t>
       </w:r>
     </w:p>
     <w:p>
@@ -30715,8 +30611,42 @@
           <w:sz w:val="24"/>
           <w:szCs w:val="24"/>
         </w:rPr>
-        <w:t>Llave foránea (Foreign Key)</w:t>
-      </w:r>
+        <w:t>Llave foránea (Foreign Key):</w:t>
+      </w:r>
+      <w:r>
+        <w:rPr>
+          <w:rFonts w:cstheme="minorHAnsi"/>
+          <w:sz w:val="24"/>
+          <w:szCs w:val="24"/>
+        </w:rPr>
+        <w:t xml:space="preserve"> Campo que establece una relación entre dos tablas de una base de datos.</w:t>
+      </w:r>
+    </w:p>
+    <w:p>
+      <w:pPr>
+        <w:pStyle w:val="Prrafodelista"/>
+        <w:spacing w:line="360" w:lineRule="auto"/>
+        <w:ind w:left="0"/>
+        <w:jc w:val="both"/>
+        <w:rPr>
+          <w:rFonts w:cstheme="minorHAnsi"/>
+          <w:sz w:val="24"/>
+          <w:szCs w:val="24"/>
+        </w:rPr>
+      </w:pPr>
+    </w:p>
+    <w:p>
+      <w:pPr>
+        <w:pStyle w:val="Prrafodelista"/>
+        <w:spacing w:line="360" w:lineRule="auto"/>
+        <w:ind w:left="0"/>
+        <w:jc w:val="both"/>
+        <w:rPr>
+          <w:rFonts w:cstheme="minorHAnsi"/>
+          <w:sz w:val="24"/>
+          <w:szCs w:val="24"/>
+        </w:rPr>
+      </w:pPr>
       <w:r>
         <w:rPr>
           <w:rFonts w:cstheme="minorHAnsi"/>
@@ -30725,23 +30655,37 @@
           <w:sz w:val="24"/>
           <w:szCs w:val="24"/>
         </w:rPr>
-        <w:t>:</w:t>
-      </w:r>
+        <w:t>Llave primaria (</w:t>
+      </w:r>
+      <w:proofErr w:type="spellStart"/>
       <w:r>
         <w:rPr>
           <w:rFonts w:cstheme="minorHAnsi"/>
-          <w:sz w:val="24"/>
-          <w:szCs w:val="24"/>
-        </w:rPr>
-        <w:t xml:space="preserve"> </w:t>
-      </w:r>
+          <w:b/>
+          <w:bCs/>
+          <w:sz w:val="24"/>
+          <w:szCs w:val="24"/>
+        </w:rPr>
+        <w:t>Primary</w:t>
+      </w:r>
+      <w:proofErr w:type="spellEnd"/>
       <w:r>
         <w:rPr>
           <w:rFonts w:cstheme="minorHAnsi"/>
-          <w:sz w:val="24"/>
-          <w:szCs w:val="24"/>
-        </w:rPr>
-        <w:t>Campo que establece una relación entre dos tablas de una base de datos.</w:t>
+          <w:b/>
+          <w:bCs/>
+          <w:sz w:val="24"/>
+          <w:szCs w:val="24"/>
+        </w:rPr>
+        <w:t xml:space="preserve"> Key):</w:t>
+      </w:r>
+      <w:r>
+        <w:rPr>
+          <w:rFonts w:cstheme="minorHAnsi"/>
+          <w:sz w:val="24"/>
+          <w:szCs w:val="24"/>
+        </w:rPr>
+        <w:t xml:space="preserve"> Campo que identifica de manera única cada registro de una tabla.</w:t>
       </w:r>
     </w:p>
     <w:p>
@@ -30777,9 +30721,42 @@
           <w:sz w:val="24"/>
           <w:szCs w:val="24"/>
         </w:rPr>
-        <w:t>Llave primaria (</w:t>
-      </w:r>
-      <w:proofErr w:type="spellStart"/>
+        <w:t>Menú</w:t>
+      </w:r>
+      <w:r>
+        <w:rPr>
+          <w:rFonts w:cstheme="minorHAnsi"/>
+          <w:sz w:val="24"/>
+          <w:szCs w:val="24"/>
+        </w:rPr>
+        <w:t>: Conjunto organizado de opciones disponibles para un usuario según el rol asignado.</w:t>
+      </w:r>
+    </w:p>
+    <w:p>
+      <w:pPr>
+        <w:pStyle w:val="Prrafodelista"/>
+        <w:spacing w:line="360" w:lineRule="auto"/>
+        <w:ind w:left="0"/>
+        <w:jc w:val="both"/>
+        <w:rPr>
+          <w:rFonts w:cstheme="minorHAnsi"/>
+          <w:sz w:val="24"/>
+          <w:szCs w:val="24"/>
+        </w:rPr>
+      </w:pPr>
+    </w:p>
+    <w:p>
+      <w:pPr>
+        <w:pStyle w:val="Prrafodelista"/>
+        <w:spacing w:line="360" w:lineRule="auto"/>
+        <w:ind w:left="0"/>
+        <w:jc w:val="both"/>
+        <w:rPr>
+          <w:rFonts w:cstheme="minorHAnsi"/>
+          <w:sz w:val="24"/>
+          <w:szCs w:val="24"/>
+        </w:rPr>
+      </w:pPr>
       <w:r>
         <w:rPr>
           <w:rFonts w:cstheme="minorHAnsi"/>
@@ -30788,9 +30765,42 @@
           <w:sz w:val="24"/>
           <w:szCs w:val="24"/>
         </w:rPr>
-        <w:t>Primary</w:t>
-      </w:r>
-      <w:proofErr w:type="spellEnd"/>
+        <w:t>Merma</w:t>
+      </w:r>
+      <w:r>
+        <w:rPr>
+          <w:rFonts w:cstheme="minorHAnsi"/>
+          <w:sz w:val="24"/>
+          <w:szCs w:val="24"/>
+        </w:rPr>
+        <w:t>: Pérdida de productos ocasionada por deterioro, vencimiento o daño.</w:t>
+      </w:r>
+    </w:p>
+    <w:p>
+      <w:pPr>
+        <w:pStyle w:val="Prrafodelista"/>
+        <w:spacing w:line="360" w:lineRule="auto"/>
+        <w:ind w:left="0"/>
+        <w:jc w:val="both"/>
+        <w:rPr>
+          <w:rFonts w:cstheme="minorHAnsi"/>
+          <w:sz w:val="24"/>
+          <w:szCs w:val="24"/>
+        </w:rPr>
+      </w:pPr>
+    </w:p>
+    <w:p>
+      <w:pPr>
+        <w:pStyle w:val="Prrafodelista"/>
+        <w:spacing w:line="360" w:lineRule="auto"/>
+        <w:ind w:left="0"/>
+        <w:jc w:val="both"/>
+        <w:rPr>
+          <w:rFonts w:cstheme="minorHAnsi"/>
+          <w:sz w:val="24"/>
+          <w:szCs w:val="24"/>
+        </w:rPr>
+      </w:pPr>
       <w:r>
         <w:rPr>
           <w:rFonts w:cstheme="minorHAnsi"/>
@@ -30799,8 +30809,43 @@
           <w:sz w:val="24"/>
           <w:szCs w:val="24"/>
         </w:rPr>
-        <w:t xml:space="preserve"> Key)</w:t>
-      </w:r>
+        <w:lastRenderedPageBreak/>
+        <w:t>Modelo Entidad-Relación</w:t>
+      </w:r>
+      <w:r>
+        <w:rPr>
+          <w:rFonts w:cstheme="minorHAnsi"/>
+          <w:sz w:val="24"/>
+          <w:szCs w:val="24"/>
+        </w:rPr>
+        <w:t>: Representación lógica de las entidades y relaciones que conforman la base de datos.</w:t>
+      </w:r>
+    </w:p>
+    <w:p>
+      <w:pPr>
+        <w:pStyle w:val="Prrafodelista"/>
+        <w:spacing w:line="360" w:lineRule="auto"/>
+        <w:ind w:left="0"/>
+        <w:jc w:val="both"/>
+        <w:rPr>
+          <w:rFonts w:cstheme="minorHAnsi"/>
+          <w:sz w:val="24"/>
+          <w:szCs w:val="24"/>
+        </w:rPr>
+      </w:pPr>
+    </w:p>
+    <w:p>
+      <w:pPr>
+        <w:pStyle w:val="Prrafodelista"/>
+        <w:spacing w:line="360" w:lineRule="auto"/>
+        <w:ind w:left="0"/>
+        <w:jc w:val="both"/>
+        <w:rPr>
+          <w:rFonts w:cstheme="minorHAnsi"/>
+          <w:sz w:val="24"/>
+          <w:szCs w:val="24"/>
+        </w:rPr>
+      </w:pPr>
       <w:r>
         <w:rPr>
           <w:rFonts w:cstheme="minorHAnsi"/>
@@ -30809,7 +30854,7 @@
           <w:sz w:val="24"/>
           <w:szCs w:val="24"/>
         </w:rPr>
-        <w:t>:</w:t>
+        <w:t>MySQL</w:t>
       </w:r>
       <w:r>
         <w:rPr>
@@ -30817,15 +30862,7 @@
           <w:sz w:val="24"/>
           <w:szCs w:val="24"/>
         </w:rPr>
-        <w:t xml:space="preserve"> </w:t>
-      </w:r>
-      <w:r>
-        <w:rPr>
-          <w:rFonts w:cstheme="minorHAnsi"/>
-          <w:sz w:val="24"/>
-          <w:szCs w:val="24"/>
-        </w:rPr>
-        <w:t>Campo que identifica de manera única cada registro de una tabla.</w:t>
+        <w:t>: Sistema gestor de bases de datos relacional utilizado por SIGEPAN.</w:t>
       </w:r>
     </w:p>
     <w:p>
@@ -30861,7 +30898,7 @@
           <w:sz w:val="24"/>
           <w:szCs w:val="24"/>
         </w:rPr>
-        <w:t>Menú</w:t>
+        <w:t>ORM:</w:t>
       </w:r>
       <w:r>
         <w:rPr>
@@ -30869,15 +30906,61 @@
           <w:sz w:val="24"/>
           <w:szCs w:val="24"/>
         </w:rPr>
-        <w:t xml:space="preserve">: </w:t>
-      </w:r>
+        <w:t xml:space="preserve"> </w:t>
+      </w:r>
+      <w:proofErr w:type="spellStart"/>
       <w:r>
         <w:rPr>
           <w:rFonts w:cstheme="minorHAnsi"/>
           <w:sz w:val="24"/>
           <w:szCs w:val="24"/>
         </w:rPr>
-        <w:t>Conjunto organizado de opciones disponibles para un usuario según el rol asignado.</w:t>
+        <w:t>Object</w:t>
+      </w:r>
+      <w:proofErr w:type="spellEnd"/>
+      <w:r>
+        <w:rPr>
+          <w:rFonts w:cstheme="minorHAnsi"/>
+          <w:sz w:val="24"/>
+          <w:szCs w:val="24"/>
+        </w:rPr>
+        <w:t xml:space="preserve"> </w:t>
+      </w:r>
+      <w:proofErr w:type="spellStart"/>
+      <w:r>
+        <w:rPr>
+          <w:rFonts w:cstheme="minorHAnsi"/>
+          <w:sz w:val="24"/>
+          <w:szCs w:val="24"/>
+        </w:rPr>
+        <w:t>Relational</w:t>
+      </w:r>
+      <w:proofErr w:type="spellEnd"/>
+      <w:r>
+        <w:rPr>
+          <w:rFonts w:cstheme="minorHAnsi"/>
+          <w:sz w:val="24"/>
+          <w:szCs w:val="24"/>
+        </w:rPr>
+        <w:t xml:space="preserve"> </w:t>
+      </w:r>
+      <w:proofErr w:type="spellStart"/>
+      <w:r>
+        <w:rPr>
+          <w:rFonts w:cstheme="minorHAnsi"/>
+          <w:sz w:val="24"/>
+          <w:szCs w:val="24"/>
+        </w:rPr>
+        <w:t>Mapping</w:t>
+      </w:r>
+      <w:proofErr w:type="spellEnd"/>
+      <w:r>
+        <w:rPr>
+          <w:rFonts w:cstheme="minorHAnsi"/>
+          <w:sz w:val="24"/>
+          <w:szCs w:val="24"/>
+        </w:rPr>
+        <w:t>. Técnica utilizada por Django para interactuar con la base de datos mediante objetos.</w:t>
       </w:r>
     </w:p>
     <w:p>
@@ -30913,7 +30996,7 @@
           <w:sz w:val="24"/>
           <w:szCs w:val="24"/>
         </w:rPr>
-        <w:t>Merma</w:t>
+        <w:t>Permiso</w:t>
       </w:r>
       <w:r>
         <w:rPr>
@@ -30921,15 +31004,7 @@
           <w:sz w:val="24"/>
           <w:szCs w:val="24"/>
         </w:rPr>
-        <w:t xml:space="preserve">: </w:t>
-      </w:r>
-      <w:r>
-        <w:rPr>
-          <w:rFonts w:cstheme="minorHAnsi"/>
-          <w:sz w:val="24"/>
-          <w:szCs w:val="24"/>
-        </w:rPr>
-        <w:t>Pérdida de productos ocasionada por deterioro, vencimiento o daño.</w:t>
+        <w:t>: Autorización asignada a un rol para ejecutar determinadas funcionalidades del sistema.</w:t>
       </w:r>
     </w:p>
     <w:p>
@@ -30965,8 +31040,7 @@
           <w:sz w:val="24"/>
           <w:szCs w:val="24"/>
         </w:rPr>
-        <w:lastRenderedPageBreak/>
-        <w:t>Modelo Entidad-Relación</w:t>
+        <w:t>Producto</w:t>
       </w:r>
       <w:r>
         <w:rPr>
@@ -30974,15 +31048,7 @@
           <w:sz w:val="24"/>
           <w:szCs w:val="24"/>
         </w:rPr>
-        <w:t xml:space="preserve">: </w:t>
-      </w:r>
-      <w:r>
-        <w:rPr>
-          <w:rFonts w:cstheme="minorHAnsi"/>
-          <w:sz w:val="24"/>
-          <w:szCs w:val="24"/>
-        </w:rPr>
-        <w:t>Representación lógica de las entidades y relaciones que conforman la base de datos.</w:t>
+        <w:t>: Artículo comercializado por la panadería y administrado mediante SIGEPAN.</w:t>
       </w:r>
     </w:p>
     <w:p>
@@ -31018,7 +31084,7 @@
           <w:sz w:val="24"/>
           <w:szCs w:val="24"/>
         </w:rPr>
-        <w:t>MySQL</w:t>
+        <w:t>Reporte</w:t>
       </w:r>
       <w:r>
         <w:rPr>
@@ -31026,15 +31092,7 @@
           <w:sz w:val="24"/>
           <w:szCs w:val="24"/>
         </w:rPr>
-        <w:t xml:space="preserve">: </w:t>
-      </w:r>
-      <w:r>
-        <w:rPr>
-          <w:rFonts w:cstheme="minorHAnsi"/>
-          <w:sz w:val="24"/>
-          <w:szCs w:val="24"/>
-        </w:rPr>
-        <w:t>Sistema gestor de bases de datos relacional utilizado por SIGEPAN.</w:t>
+        <w:t>: Documento generado automáticamente por el sistema con información administrativa, operativa o tributaria.</w:t>
       </w:r>
     </w:p>
     <w:p>
@@ -31070,8 +31128,42 @@
           <w:sz w:val="24"/>
           <w:szCs w:val="24"/>
         </w:rPr>
-        <w:t>OR</w:t>
-      </w:r>
+        <w:t>Requerimiento funcional</w:t>
+      </w:r>
+      <w:r>
+        <w:rPr>
+          <w:rFonts w:cstheme="minorHAnsi"/>
+          <w:sz w:val="24"/>
+          <w:szCs w:val="24"/>
+        </w:rPr>
+        <w:t>: Funcionalidad específica que el sistema debe implementar para satisfacer una necesidad del usuario.</w:t>
+      </w:r>
+    </w:p>
+    <w:p>
+      <w:pPr>
+        <w:pStyle w:val="Prrafodelista"/>
+        <w:spacing w:line="360" w:lineRule="auto"/>
+        <w:ind w:left="0"/>
+        <w:jc w:val="both"/>
+        <w:rPr>
+          <w:rFonts w:cstheme="minorHAnsi"/>
+          <w:sz w:val="24"/>
+          <w:szCs w:val="24"/>
+        </w:rPr>
+      </w:pPr>
+    </w:p>
+    <w:p>
+      <w:pPr>
+        <w:pStyle w:val="Prrafodelista"/>
+        <w:spacing w:line="360" w:lineRule="auto"/>
+        <w:ind w:left="0"/>
+        <w:jc w:val="both"/>
+        <w:rPr>
+          <w:rFonts w:cstheme="minorHAnsi"/>
+          <w:sz w:val="24"/>
+          <w:szCs w:val="24"/>
+        </w:rPr>
+      </w:pPr>
       <w:r>
         <w:rPr>
           <w:rFonts w:cstheme="minorHAnsi"/>
@@ -31080,7 +31172,7 @@
           <w:sz w:val="24"/>
           <w:szCs w:val="24"/>
         </w:rPr>
-        <w:t>M:</w:t>
+        <w:t>Rol</w:t>
       </w:r>
       <w:r>
         <w:rPr>
@@ -31088,61 +31180,7 @@
           <w:sz w:val="24"/>
           <w:szCs w:val="24"/>
         </w:rPr>
-        <w:t xml:space="preserve"> </w:t>
-      </w:r>
-      <w:proofErr w:type="spellStart"/>
-      <w:r>
-        <w:rPr>
-          <w:rFonts w:cstheme="minorHAnsi"/>
-          <w:sz w:val="24"/>
-          <w:szCs w:val="24"/>
-        </w:rPr>
-        <w:t>Object</w:t>
-      </w:r>
-      <w:proofErr w:type="spellEnd"/>
-      <w:r>
-        <w:rPr>
-          <w:rFonts w:cstheme="minorHAnsi"/>
-          <w:sz w:val="24"/>
-          <w:szCs w:val="24"/>
-        </w:rPr>
-        <w:t xml:space="preserve"> </w:t>
-      </w:r>
-      <w:proofErr w:type="spellStart"/>
-      <w:r>
-        <w:rPr>
-          <w:rFonts w:cstheme="minorHAnsi"/>
-          <w:sz w:val="24"/>
-          <w:szCs w:val="24"/>
-        </w:rPr>
-        <w:t>Relational</w:t>
-      </w:r>
-      <w:proofErr w:type="spellEnd"/>
-      <w:r>
-        <w:rPr>
-          <w:rFonts w:cstheme="minorHAnsi"/>
-          <w:sz w:val="24"/>
-          <w:szCs w:val="24"/>
-        </w:rPr>
-        <w:t xml:space="preserve"> </w:t>
-      </w:r>
-      <w:proofErr w:type="spellStart"/>
-      <w:r>
-        <w:rPr>
-          <w:rFonts w:cstheme="minorHAnsi"/>
-          <w:sz w:val="24"/>
-          <w:szCs w:val="24"/>
-        </w:rPr>
-        <w:t>Mapping</w:t>
-      </w:r>
-      <w:proofErr w:type="spellEnd"/>
-      <w:r>
-        <w:rPr>
-          <w:rFonts w:cstheme="minorHAnsi"/>
-          <w:sz w:val="24"/>
-          <w:szCs w:val="24"/>
-        </w:rPr>
-        <w:t>. Técnica utilizada por Django para interactuar con la base de datos mediante objetos.</w:t>
+        <w:t>: Conjunto de permisos asignados a un usuario dentro del sistema.</w:t>
       </w:r>
     </w:p>
     <w:p>
@@ -31178,7 +31216,7 @@
           <w:sz w:val="24"/>
           <w:szCs w:val="24"/>
         </w:rPr>
-        <w:t>Permiso</w:t>
+        <w:t>SIGEPAN</w:t>
       </w:r>
       <w:r>
         <w:rPr>
@@ -31186,15 +31224,7 @@
           <w:sz w:val="24"/>
           <w:szCs w:val="24"/>
         </w:rPr>
-        <w:t xml:space="preserve">: </w:t>
-      </w:r>
-      <w:r>
-        <w:rPr>
-          <w:rFonts w:cstheme="minorHAnsi"/>
-          <w:sz w:val="24"/>
-          <w:szCs w:val="24"/>
-        </w:rPr>
-        <w:t>Autorización asignada a un rol para ejecutar determinadas funcionalidades del sistema.</w:t>
+        <w:t>: Sistema Integral de Gestión para Panaderías desarrollado para automatizar los procesos administrativos y operativos de la empresa La Pana.</w:t>
       </w:r>
     </w:p>
     <w:p>
@@ -31230,7 +31260,7 @@
           <w:sz w:val="24"/>
           <w:szCs w:val="24"/>
         </w:rPr>
-        <w:t>Producto</w:t>
+        <w:t>SQL</w:t>
       </w:r>
       <w:r>
         <w:rPr>
@@ -31238,15 +31268,7 @@
           <w:sz w:val="24"/>
           <w:szCs w:val="24"/>
         </w:rPr>
-        <w:t xml:space="preserve">: </w:t>
-      </w:r>
-      <w:r>
-        <w:rPr>
-          <w:rFonts w:cstheme="minorHAnsi"/>
-          <w:sz w:val="24"/>
-          <w:szCs w:val="24"/>
-        </w:rPr>
-        <w:t>Artículo comercializado por la panadería y administrado mediante SIGEPAN.</w:t>
+        <w:t>: Lenguaje estructurado utilizado para definir y manipular bases de datos relacionales.</w:t>
       </w:r>
     </w:p>
     <w:p>
@@ -31282,7 +31304,7 @@
           <w:sz w:val="24"/>
           <w:szCs w:val="24"/>
         </w:rPr>
-        <w:t>Reporte</w:t>
+        <w:t>Transacción</w:t>
       </w:r>
       <w:r>
         <w:rPr>
@@ -31290,15 +31312,7 @@
           <w:sz w:val="24"/>
           <w:szCs w:val="24"/>
         </w:rPr>
-        <w:t xml:space="preserve">: </w:t>
-      </w:r>
-      <w:r>
-        <w:rPr>
-          <w:rFonts w:cstheme="minorHAnsi"/>
-          <w:sz w:val="24"/>
-          <w:szCs w:val="24"/>
-        </w:rPr>
-        <w:t>Documento generado automáticamente por el sistema con información administrativa, operativa o tributaria.</w:t>
+        <w:t>: Conjunto de operaciones ejecutadas como una única unidad lógica dentro de la base de datos.</w:t>
       </w:r>
     </w:p>
     <w:p>
@@ -31334,7 +31348,7 @@
           <w:sz w:val="24"/>
           <w:szCs w:val="24"/>
         </w:rPr>
-        <w:t>Requerimiento funcional</w:t>
+        <w:t>Usuario</w:t>
       </w:r>
       <w:r>
         <w:rPr>
@@ -31342,15 +31356,7 @@
           <w:sz w:val="24"/>
           <w:szCs w:val="24"/>
         </w:rPr>
-        <w:t xml:space="preserve">: </w:t>
-      </w:r>
-      <w:r>
-        <w:rPr>
-          <w:rFonts w:cstheme="minorHAnsi"/>
-          <w:sz w:val="24"/>
-          <w:szCs w:val="24"/>
-        </w:rPr>
-        <w:t>Funcionalidad específica que el sistema debe implementar para satisfacer una necesidad del usuario.</w:t>
+        <w:t>: Persona autorizada para acceder al sistema mediante credenciales válidas.</w:t>
       </w:r>
     </w:p>
     <w:p>
@@ -31386,7 +31392,7 @@
           <w:sz w:val="24"/>
           <w:szCs w:val="24"/>
         </w:rPr>
-        <w:t>Rol</w:t>
+        <w:t>Venta</w:t>
       </w:r>
       <w:r>
         <w:rPr>
@@ -31394,275 +31400,7 @@
           <w:sz w:val="24"/>
           <w:szCs w:val="24"/>
         </w:rPr>
-        <w:t xml:space="preserve">: </w:t>
-      </w:r>
-      <w:r>
-        <w:rPr>
-          <w:rFonts w:cstheme="minorHAnsi"/>
-          <w:sz w:val="24"/>
-          <w:szCs w:val="24"/>
-        </w:rPr>
-        <w:t>Conjunto de permisos asignados a un usuario dentro del sistema.</w:t>
-      </w:r>
-    </w:p>
-    <w:p>
-      <w:pPr>
-        <w:pStyle w:val="Prrafodelista"/>
-        <w:spacing w:line="360" w:lineRule="auto"/>
-        <w:ind w:left="0"/>
-        <w:jc w:val="both"/>
-        <w:rPr>
-          <w:rFonts w:cstheme="minorHAnsi"/>
-          <w:sz w:val="24"/>
-          <w:szCs w:val="24"/>
-        </w:rPr>
-      </w:pPr>
-    </w:p>
-    <w:p>
-      <w:pPr>
-        <w:pStyle w:val="Prrafodelista"/>
-        <w:spacing w:line="360" w:lineRule="auto"/>
-        <w:ind w:left="0"/>
-        <w:jc w:val="both"/>
-        <w:rPr>
-          <w:rFonts w:cstheme="minorHAnsi"/>
-          <w:sz w:val="24"/>
-          <w:szCs w:val="24"/>
-        </w:rPr>
-      </w:pPr>
-      <w:r>
-        <w:rPr>
-          <w:rFonts w:cstheme="minorHAnsi"/>
-          <w:b/>
-          <w:bCs/>
-          <w:sz w:val="24"/>
-          <w:szCs w:val="24"/>
-        </w:rPr>
-        <w:t>SIGEPAN</w:t>
-      </w:r>
-      <w:r>
-        <w:rPr>
-          <w:rFonts w:cstheme="minorHAnsi"/>
-          <w:sz w:val="24"/>
-          <w:szCs w:val="24"/>
-        </w:rPr>
-        <w:t xml:space="preserve">: </w:t>
-      </w:r>
-      <w:r>
-        <w:rPr>
-          <w:rFonts w:cstheme="minorHAnsi"/>
-          <w:sz w:val="24"/>
-          <w:szCs w:val="24"/>
-        </w:rPr>
-        <w:t>Sistema Integral de Gestión para Panaderías desarrollado para automatizar los procesos administrativos y operativos de la empresa La Pana.</w:t>
-      </w:r>
-    </w:p>
-    <w:p>
-      <w:pPr>
-        <w:pStyle w:val="Prrafodelista"/>
-        <w:spacing w:line="360" w:lineRule="auto"/>
-        <w:ind w:left="0"/>
-        <w:jc w:val="both"/>
-        <w:rPr>
-          <w:rFonts w:cstheme="minorHAnsi"/>
-          <w:sz w:val="24"/>
-          <w:szCs w:val="24"/>
-        </w:rPr>
-      </w:pPr>
-    </w:p>
-    <w:p>
-      <w:pPr>
-        <w:pStyle w:val="Prrafodelista"/>
-        <w:spacing w:line="360" w:lineRule="auto"/>
-        <w:ind w:left="0"/>
-        <w:jc w:val="both"/>
-        <w:rPr>
-          <w:rFonts w:cstheme="minorHAnsi"/>
-          <w:sz w:val="24"/>
-          <w:szCs w:val="24"/>
-        </w:rPr>
-      </w:pPr>
-      <w:r>
-        <w:rPr>
-          <w:rFonts w:cstheme="minorHAnsi"/>
-          <w:b/>
-          <w:bCs/>
-          <w:sz w:val="24"/>
-          <w:szCs w:val="24"/>
-        </w:rPr>
-        <w:t>SQL</w:t>
-      </w:r>
-      <w:r>
-        <w:rPr>
-          <w:rFonts w:cstheme="minorHAnsi"/>
-          <w:sz w:val="24"/>
-          <w:szCs w:val="24"/>
-        </w:rPr>
-        <w:t xml:space="preserve">: </w:t>
-      </w:r>
-      <w:r>
-        <w:rPr>
-          <w:rFonts w:cstheme="minorHAnsi"/>
-          <w:sz w:val="24"/>
-          <w:szCs w:val="24"/>
-        </w:rPr>
-        <w:t>Lenguaje estructurado utilizado para definir y manipular bases de datos relacionales.</w:t>
-      </w:r>
-    </w:p>
-    <w:p>
-      <w:pPr>
-        <w:pStyle w:val="Prrafodelista"/>
-        <w:spacing w:line="360" w:lineRule="auto"/>
-        <w:ind w:left="0"/>
-        <w:jc w:val="both"/>
-        <w:rPr>
-          <w:rFonts w:cstheme="minorHAnsi"/>
-          <w:sz w:val="24"/>
-          <w:szCs w:val="24"/>
-        </w:rPr>
-      </w:pPr>
-    </w:p>
-    <w:p>
-      <w:pPr>
-        <w:pStyle w:val="Prrafodelista"/>
-        <w:spacing w:line="360" w:lineRule="auto"/>
-        <w:ind w:left="0"/>
-        <w:jc w:val="both"/>
-        <w:rPr>
-          <w:rFonts w:cstheme="minorHAnsi"/>
-          <w:sz w:val="24"/>
-          <w:szCs w:val="24"/>
-        </w:rPr>
-      </w:pPr>
-      <w:r>
-        <w:rPr>
-          <w:rFonts w:cstheme="minorHAnsi"/>
-          <w:b/>
-          <w:bCs/>
-          <w:sz w:val="24"/>
-          <w:szCs w:val="24"/>
-        </w:rPr>
-        <w:t>Transacción</w:t>
-      </w:r>
-      <w:r>
-        <w:rPr>
-          <w:rFonts w:cstheme="minorHAnsi"/>
-          <w:sz w:val="24"/>
-          <w:szCs w:val="24"/>
-        </w:rPr>
-        <w:t xml:space="preserve">: </w:t>
-      </w:r>
-      <w:r>
-        <w:rPr>
-          <w:rFonts w:cstheme="minorHAnsi"/>
-          <w:sz w:val="24"/>
-          <w:szCs w:val="24"/>
-        </w:rPr>
-        <w:t>Conjunto de operaciones ejecutadas como una única unidad lógica dentro de la base de datos.</w:t>
-      </w:r>
-    </w:p>
-    <w:p>
-      <w:pPr>
-        <w:pStyle w:val="Prrafodelista"/>
-        <w:spacing w:line="360" w:lineRule="auto"/>
-        <w:ind w:left="0"/>
-        <w:jc w:val="both"/>
-        <w:rPr>
-          <w:rFonts w:cstheme="minorHAnsi"/>
-          <w:sz w:val="24"/>
-          <w:szCs w:val="24"/>
-        </w:rPr>
-      </w:pPr>
-    </w:p>
-    <w:p>
-      <w:pPr>
-        <w:pStyle w:val="Prrafodelista"/>
-        <w:spacing w:line="360" w:lineRule="auto"/>
-        <w:ind w:left="0"/>
-        <w:jc w:val="both"/>
-        <w:rPr>
-          <w:rFonts w:cstheme="minorHAnsi"/>
-          <w:sz w:val="24"/>
-          <w:szCs w:val="24"/>
-        </w:rPr>
-      </w:pPr>
-      <w:r>
-        <w:rPr>
-          <w:rFonts w:cstheme="minorHAnsi"/>
-          <w:b/>
-          <w:bCs/>
-          <w:sz w:val="24"/>
-          <w:szCs w:val="24"/>
-        </w:rPr>
-        <w:t>Usuario</w:t>
-      </w:r>
-      <w:r>
-        <w:rPr>
-          <w:rFonts w:cstheme="minorHAnsi"/>
-          <w:sz w:val="24"/>
-          <w:szCs w:val="24"/>
-        </w:rPr>
-        <w:t xml:space="preserve">: </w:t>
-      </w:r>
-      <w:r>
-        <w:rPr>
-          <w:rFonts w:cstheme="minorHAnsi"/>
-          <w:sz w:val="24"/>
-          <w:szCs w:val="24"/>
-        </w:rPr>
-        <w:t>Persona autorizada para acceder al sistema mediante credenciales válidas.</w:t>
-      </w:r>
-    </w:p>
-    <w:p>
-      <w:pPr>
-        <w:pStyle w:val="Prrafodelista"/>
-        <w:spacing w:line="360" w:lineRule="auto"/>
-        <w:ind w:left="0"/>
-        <w:jc w:val="both"/>
-        <w:rPr>
-          <w:rFonts w:cstheme="minorHAnsi"/>
-          <w:sz w:val="24"/>
-          <w:szCs w:val="24"/>
-        </w:rPr>
-      </w:pPr>
-    </w:p>
-    <w:p>
-      <w:pPr>
-        <w:pStyle w:val="Prrafodelista"/>
-        <w:spacing w:line="360" w:lineRule="auto"/>
-        <w:ind w:left="0"/>
-        <w:jc w:val="both"/>
-        <w:rPr>
-          <w:rFonts w:cstheme="minorHAnsi"/>
-          <w:sz w:val="24"/>
-          <w:szCs w:val="24"/>
-        </w:rPr>
-      </w:pPr>
-      <w:r>
-        <w:rPr>
-          <w:rFonts w:cstheme="minorHAnsi"/>
-          <w:b/>
-          <w:bCs/>
-          <w:sz w:val="24"/>
-          <w:szCs w:val="24"/>
-        </w:rPr>
-        <w:t>Venta</w:t>
-      </w:r>
-      <w:r>
-        <w:rPr>
-          <w:rFonts w:cstheme="minorHAnsi"/>
-          <w:sz w:val="24"/>
-          <w:szCs w:val="24"/>
-        </w:rPr>
-        <w:t xml:space="preserve">: </w:t>
-      </w:r>
-      <w:r>
-        <w:rPr>
-          <w:rFonts w:cstheme="minorHAnsi"/>
-          <w:sz w:val="24"/>
-          <w:szCs w:val="24"/>
-        </w:rPr>
-        <w:t>Proceso mediante el cual se registra la comercialización de productos y la correspondiente actualización del inventario y caja.</w:t>
+        <w:t>: Proceso mediante el cual se registra la comercialización de productos y la correspondiente actualización del inventario y caja.</w:t>
       </w:r>
     </w:p>
     <w:sectPr>
@@ -34469,6 +34207,7 @@
   <w:style w:type="character" w:default="1" w:styleId="Fuentedeprrafopredeter">
     <w:name w:val="Default Paragraph Font"/>
     <w:uiPriority w:val="1"/>
+    <w:semiHidden/>
     <w:unhideWhenUsed/>
   </w:style>
   <w:style w:type="table" w:default="1" w:styleId="Tablanormal">

</xml_diff>